<commit_message>
Finalising and fixing all bugs
</commit_message>
<xml_diff>
--- a/docs/showcase/student-5-video-script.docx
+++ b/docs/showcase/student-5-video-script.docx
@@ -68,7 +68,7 @@
           <w:sz w:val="20"/>
           <w:szCs w:val="20"/>
         </w:rPr>
-        <w:t xml:space="preserve">90 seconds</w:t>
+        <w:t xml:space="preserve">85 seconds</w:t>
       </w:r>
       <w:r>
         <w:rPr>
@@ -76,7 +76,7 @@
           <w:sz w:val="20"/>
           <w:szCs w:val="20"/>
         </w:rPr>
-        <w:t xml:space="preserve">   ·   five features × 90s + 2.5 min of group segments = 10:00</w:t>
+        <w:t xml:space="preserve">   ·   opening 0:40 + five features × 85s + deployment 0:55 + CI/CD 1:05 + close 0:20 = 10:00</w:t>
       </w:r>
     </w:p>
     <w:p>
@@ -372,7 +372,7 @@
                 <w:sz w:val="21"/>
                 <w:szCs w:val="21"/>
               </w:rPr>
-              <w:t xml:space="preserve">History table and filters</w:t>
+              <w:t xml:space="preserve">History table loads</w:t>
             </w:r>
           </w:p>
         </w:tc>
@@ -524,7 +524,7 @@
                 <w:sz w:val="21"/>
                 <w:szCs w:val="21"/>
               </w:rPr>
-              <w:t xml:space="preserve">Over-limit transfer rejected</w:t>
+              <w:t xml:space="preserve">Over-limit rejected, then cancel</w:t>
             </w:r>
           </w:p>
         </w:tc>
@@ -548,7 +548,7 @@
                 <w:sz w:val="21"/>
                 <w:szCs w:val="21"/>
               </w:rPr>
-              <w:t xml:space="preserve">Business rules</w:t>
+              <w:t xml:space="preserve">Business rules + Update</w:t>
             </w:r>
           </w:p>
         </w:tc>
@@ -577,82 +577,6 @@
                 <w:szCs w:val="21"/>
               </w:rPr>
               <w:t xml:space="preserve">5</w:t>
-            </w:r>
-          </w:p>
-        </w:tc>
-        <w:tc>
-          <w:tcPr>
-            <w:tcW w:type="dxa" w:w="4400"/>
-            <w:tcMar>
-              <w:top w:type="dxa" w:w="80"/>
-              <w:left w:type="dxa" w:w="120"/>
-              <w:bottom w:type="dxa" w:w="80"/>
-              <w:right w:type="dxa" w:w="120"/>
-            </w:tcMar>
-          </w:tcPr>
-          <w:p>
-            <w:pPr>
-              <w:spacing w:after="0" w:line="276"/>
-            </w:pPr>
-            <w:r>
-              <w:rPr>
-                <w:color w:val="12191C"/>
-                <w:sz w:val="21"/>
-                <w:szCs w:val="21"/>
-              </w:rPr>
-              <w:t xml:space="preserve">Cancel a pending transaction</w:t>
-            </w:r>
-          </w:p>
-        </w:tc>
-        <w:tc>
-          <w:tcPr>
-            <w:tcW w:type="dxa" w:w="3300"/>
-            <w:tcMar>
-              <w:top w:type="dxa" w:w="80"/>
-              <w:left w:type="dxa" w:w="120"/>
-              <w:bottom w:type="dxa" w:w="80"/>
-              <w:right w:type="dxa" w:w="120"/>
-            </w:tcMar>
-          </w:tcPr>
-          <w:p>
-            <w:pPr>
-              <w:spacing w:after="0" w:line="276"/>
-            </w:pPr>
-            <w:r>
-              <w:rPr>
-                <w:color w:val="6B7A75"/>
-                <w:sz w:val="21"/>
-                <w:szCs w:val="21"/>
-              </w:rPr>
-              <w:t xml:space="preserve">Update / Delete</w:t>
-            </w:r>
-          </w:p>
-        </w:tc>
-      </w:tr>
-      <w:tr>
-        <w:tc>
-          <w:tcPr>
-            <w:tcW w:type="dxa" w:w="1100"/>
-            <w:tcMar>
-              <w:top w:type="dxa" w:w="80"/>
-              <w:left w:type="dxa" w:w="120"/>
-              <w:bottom w:type="dxa" w:w="80"/>
-              <w:right w:type="dxa" w:w="120"/>
-            </w:tcMar>
-          </w:tcPr>
-          <w:p>
-            <w:pPr>
-              <w:spacing w:after="0" w:line="276"/>
-            </w:pPr>
-            <w:r>
-              <w:rPr>
-                <w:b/>
-                <w:bCs/>
-                <w:color w:val="0A6A4F"/>
-                <w:sz w:val="21"/>
-                <w:szCs w:val="21"/>
-              </w:rPr>
-              <w:t xml:space="preserve">6</w:t>
             </w:r>
           </w:p>
         </w:tc>
@@ -728,83 +652,7 @@
                 <w:sz w:val="21"/>
                 <w:szCs w:val="21"/>
               </w:rPr>
-              <w:t xml:space="preserve">7</w:t>
-            </w:r>
-          </w:p>
-        </w:tc>
-        <w:tc>
-          <w:tcPr>
-            <w:tcW w:type="dxa" w:w="4400"/>
-            <w:tcMar>
-              <w:top w:type="dxa" w:w="80"/>
-              <w:left w:type="dxa" w:w="120"/>
-              <w:bottom w:type="dxa" w:w="80"/>
-              <w:right w:type="dxa" w:w="120"/>
-            </w:tcMar>
-          </w:tcPr>
-          <w:p>
-            <w:pPr>
-              <w:spacing w:after="0" w:line="276"/>
-            </w:pPr>
-            <w:r>
-              <w:rPr>
-                <w:color w:val="12191C"/>
-                <w:sz w:val="21"/>
-                <w:szCs w:val="21"/>
-              </w:rPr>
-              <w:t xml:space="preserve">Summarise money flow</w:t>
-            </w:r>
-          </w:p>
-        </w:tc>
-        <w:tc>
-          <w:tcPr>
-            <w:tcW w:type="dxa" w:w="3300"/>
-            <w:tcMar>
-              <w:top w:type="dxa" w:w="80"/>
-              <w:left w:type="dxa" w:w="120"/>
-              <w:bottom w:type="dxa" w:w="80"/>
-              <w:right w:type="dxa" w:w="120"/>
-            </w:tcMar>
-          </w:tcPr>
-          <w:p>
-            <w:pPr>
-              <w:spacing w:after="0" w:line="276"/>
-            </w:pPr>
-            <w:r>
-              <w:rPr>
-                <w:color w:val="6B7A75"/>
-                <w:sz w:val="21"/>
-                <w:szCs w:val="21"/>
-              </w:rPr>
-              <w:t xml:space="preserve">AI-Mode (optional)</w:t>
-            </w:r>
-          </w:p>
-        </w:tc>
-      </w:tr>
-      <w:tr>
-        <w:tc>
-          <w:tcPr>
-            <w:tcW w:type="dxa" w:w="1100"/>
-            <w:tcMar>
-              <w:top w:type="dxa" w:w="80"/>
-              <w:left w:type="dxa" w:w="120"/>
-              <w:bottom w:type="dxa" w:w="80"/>
-              <w:right w:type="dxa" w:w="120"/>
-            </w:tcMar>
-          </w:tcPr>
-          <w:p>
-            <w:pPr>
-              <w:spacing w:after="0" w:line="276"/>
-            </w:pPr>
-            <w:r>
-              <w:rPr>
-                <w:b/>
-                <w:bCs/>
-                <w:color w:val="0A6A4F"/>
-                <w:sz w:val="21"/>
-                <w:szCs w:val="21"/>
-              </w:rPr>
-              <w:t xml:space="preserve">8</w:t>
+              <w:t xml:space="preserve">6</w:t>
             </w:r>
           </w:p>
         </w:tc>
@@ -1150,7 +998,7 @@
           <w:sz w:val="19"/>
           <w:szCs w:val="19"/>
         </w:rPr>
-        <w:t xml:space="preserve">        0:00 – 0:10</w:t>
+        <w:t xml:space="preserve">        0:00 – 0:08</w:t>
       </w:r>
     </w:p>
     <w:p>
@@ -1208,7 +1056,7 @@
           <w:sz w:val="22"/>
           <w:szCs w:val="22"/>
         </w:rPr>
-        <w:t xml:space="preserve">“I’m Gia, and I built Transaction Management. I’m starting from our shared home page, which is the single entry point to all five features. Clicking Transactions routes me to my frontend.”</w:t>
+        <w:t xml:space="preserve">“I’m Gia — Transaction Management. Starting from our shared home page, which routes to all five features.”</w:t>
       </w:r>
     </w:p>
     <w:p>
@@ -1242,7 +1090,7 @@
           <w:sz w:val="19"/>
           <w:szCs w:val="19"/>
         </w:rPr>
-        <w:t xml:space="preserve">        0:10 – 0:22</w:t>
+        <w:t xml:space="preserve">        0:08 – 0:16</w:t>
       </w:r>
     </w:p>
     <w:p>
@@ -1265,24 +1113,7 @@
           <w:sz w:val="21"/>
           <w:szCs w:val="21"/>
         </w:rPr>
-        <w:t xml:space="preserve">The table loads on its own. Set the Type filter to </w:t>
-      </w:r>
-      <w:r>
-        <w:rPr>
-          <w:rFonts w:ascii="Consolas" w:cs="Consolas" w:eastAsia="Consolas" w:hAnsi="Consolas"/>
-          <w:color w:val="12191C"/>
-          <w:sz w:val="20"/>
-          <w:szCs w:val="20"/>
-        </w:rPr>
-        <w:t xml:space="preserve">TRANSFER</w:t>
-      </w:r>
-      <w:r>
-        <w:rPr>
-          <w:color w:val="12191C"/>
-          <w:sz w:val="21"/>
-          <w:szCs w:val="21"/>
-        </w:rPr>
-        <w:t xml:space="preserve">.</w:t>
+        <w:t xml:space="preserve">The table loads on its own. Do not touch the filters.</w:t>
       </w:r>
     </w:p>
     <w:p>
@@ -1299,7 +1130,7 @@
           <w:sz w:val="22"/>
           <w:szCs w:val="22"/>
         </w:rPr>
-        <w:t xml:space="preserve">“My transaction history loads immediately. It comes from my backend, which reads through my own database API — it never opens the SQLite file directly, and no other feature opens mine. I can filter by type, status or account.”</w:t>
+        <w:t xml:space="preserve">“My history loads straight away, through my own database API. No other feature opens my SQLite file, and mine never opens theirs.”</w:t>
       </w:r>
     </w:p>
     <w:p>
@@ -1333,7 +1164,7 @@
           <w:sz w:val="19"/>
           <w:szCs w:val="19"/>
         </w:rPr>
-        <w:t xml:space="preserve">        0:22 – 0:44</w:t>
+        <w:t xml:space="preserve">        0:16 – 0:36</w:t>
       </w:r>
     </w:p>
     <w:p>
@@ -1424,7 +1255,7 @@
           <w:sz w:val="22"/>
           <w:szCs w:val="22"/>
         </w:rPr>
-        <w:t xml:space="preserve">“Now a transfer: three hundred dollars from account 1001 to 1002.”</w:t>
+        <w:t xml:space="preserve">“A transfer: three hundred dollars from 1001 to 1002.”</w:t>
       </w:r>
     </w:p>
     <w:p>
@@ -1457,7 +1288,7 @@
           <w:sz w:val="22"/>
           <w:szCs w:val="22"/>
         </w:rPr>
-        <w:t xml:space="preserve">“Before this is recorded, my backend calls Binh’s Account service to check both accounts exist and that there are sufficient funds. It then updates both balances, and notifies Ivan’s Notification service.”</w:t>
+        <w:t xml:space="preserve">“Before this is recorded, my backend calls Binh’s Account service to check both accounts exist and that there are sufficient funds, then updates both balances and notifies Ivan’s Notification service.”</w:t>
       </w:r>
     </w:p>
     <w:p>
@@ -1497,7 +1328,7 @@
           <w:sz w:val="22"/>
           <w:szCs w:val="22"/>
         </w:rPr>
-        <w:t xml:space="preserve">“Completed, and at the top of the history.”</w:t>
+        <w:t xml:space="preserve">“Completed, top of the history.”</w:t>
       </w:r>
     </w:p>
     <w:p>
@@ -1522,7 +1353,7 @@
           <w:sz w:val="24"/>
           <w:szCs w:val="24"/>
         </w:rPr>
-        <w:t xml:space="preserve">   Business rules</w:t>
+        <w:t xml:space="preserve">   Business rules, then cancel</w:t>
       </w:r>
       <w:r>
         <w:rPr>
@@ -1531,7 +1362,7 @@
           <w:sz w:val="19"/>
           <w:szCs w:val="19"/>
         </w:rPr>
-        <w:t xml:space="preserve">        0:44 – 0:54</w:t>
+        <w:t xml:space="preserve">        0:36 – 0:50</w:t>
       </w:r>
     </w:p>
     <w:p>
@@ -1571,7 +1402,42 @@
           <w:sz w:val="21"/>
           <w:szCs w:val="21"/>
         </w:rPr>
-        <w:t xml:space="preserve">. Submit.</w:t>
+        <w:t xml:space="preserve">. Submit. Then click </w:t>
+      </w:r>
+      <w:r>
+        <w:rPr>
+          <w:b/>
+          <w:bCs/>
+          <w:color w:val="12191C"/>
+          <w:sz w:val="21"/>
+          <w:szCs w:val="21"/>
+        </w:rPr>
+        <w:t xml:space="preserve">Cancel</w:t>
+      </w:r>
+      <w:r>
+        <w:rPr>
+          <w:color w:val="12191C"/>
+          <w:sz w:val="21"/>
+          <w:szCs w:val="21"/>
+        </w:rPr>
+        <w:t xml:space="preserve"> on a </w:t>
+      </w:r>
+      <w:r>
+        <w:rPr>
+          <w:rFonts w:ascii="Consolas" w:cs="Consolas" w:eastAsia="Consolas" w:hAnsi="Consolas"/>
+          <w:color w:val="12191C"/>
+          <w:sz w:val="20"/>
+          <w:szCs w:val="20"/>
+        </w:rPr>
+        <w:t xml:space="preserve">PENDING</w:t>
+      </w:r>
+      <w:r>
+        <w:rPr>
+          <w:color w:val="12191C"/>
+          <w:sz w:val="21"/>
+          <w:szCs w:val="21"/>
+        </w:rPr>
+        <w:t xml:space="preserve"> row.</w:t>
       </w:r>
     </w:p>
     <w:p>
@@ -1588,99 +1454,23 @@
           <w:sz w:val="22"/>
           <w:szCs w:val="22"/>
         </w:rPr>
-        <w:t xml:space="preserve">“If I try to send more than the balance, it’s rejected and no transaction is created. Those rules live in my backend, not in the database.”</w:t>
-      </w:r>
-    </w:p>
-    <w:p>
-      <w:pPr>
-        <w:spacing w:after="120" w:before="300"/>
-      </w:pPr>
-      <w:r>
-        <w:rPr>
-          <w:b/>
-          <w:bCs/>
-          <w:color w:val="0A6A4F"/>
-          <w:sz w:val="26"/>
-          <w:szCs w:val="26"/>
-        </w:rPr>
-        <w:t xml:space="preserve">5</w:t>
-      </w:r>
-      <w:r>
-        <w:rPr>
-          <w:b/>
-          <w:bCs/>
-          <w:color w:val="12191C"/>
-          <w:sz w:val="24"/>
-          <w:szCs w:val="24"/>
-        </w:rPr>
-        <w:t xml:space="preserve">   Update and cancel</w:t>
-      </w:r>
-      <w:r>
-        <w:rPr>
-          <w:rFonts w:ascii="Consolas" w:cs="Consolas" w:eastAsia="Consolas" w:hAnsi="Consolas"/>
+        <w:t xml:space="preserve">“Over the balance is rejected — that rule lives in my backend, not the database.”</w:t>
+      </w:r>
+    </w:p>
+    <w:p>
+      <w:pPr>
+        <w:spacing w:after="80"/>
+        <w:ind w:left="431"/>
+      </w:pPr>
+      <w:r>
+        <w:rPr>
+          <w:i/>
+          <w:iCs/>
           <w:color w:val="6B7A75"/>
           <w:sz w:val="19"/>
           <w:szCs w:val="19"/>
         </w:rPr>
-        <w:t xml:space="preserve">        0:54 – 1:04</w:t>
-      </w:r>
-    </w:p>
-    <w:p>
-      <w:pPr>
-        <w:spacing w:after="100"/>
-      </w:pPr>
-      <w:r>
-        <w:rPr>
-          <w:b/>
-          <w:bCs/>
-          <w:color w:val="0A6A4F"/>
-          <w:sz w:val="18"/>
-          <w:szCs w:val="18"/>
-        </w:rPr>
-        <w:t xml:space="preserve">DO   </w:t>
-      </w:r>
-      <w:r>
-        <w:rPr>
-          <w:color w:val="12191C"/>
-          <w:sz w:val="21"/>
-          <w:szCs w:val="21"/>
-        </w:rPr>
-        <w:t xml:space="preserve">Click </w:t>
-      </w:r>
-      <w:r>
-        <w:rPr>
-          <w:b/>
-          <w:bCs/>
-          <w:color w:val="12191C"/>
-          <w:sz w:val="21"/>
-          <w:szCs w:val="21"/>
-        </w:rPr>
-        <w:t xml:space="preserve">Cancel</w:t>
-      </w:r>
-      <w:r>
-        <w:rPr>
-          <w:color w:val="12191C"/>
-          <w:sz w:val="21"/>
-          <w:szCs w:val="21"/>
-        </w:rPr>
-        <w:t xml:space="preserve"> on a </w:t>
-      </w:r>
-      <w:r>
-        <w:rPr>
-          <w:rFonts w:ascii="Consolas" w:cs="Consolas" w:eastAsia="Consolas" w:hAnsi="Consolas"/>
-          <w:color w:val="12191C"/>
-          <w:sz w:val="20"/>
-          <w:szCs w:val="20"/>
-        </w:rPr>
-        <w:t xml:space="preserve">PENDING</w:t>
-      </w:r>
-      <w:r>
-        <w:rPr>
-          <w:color w:val="12191C"/>
-          <w:sz w:val="21"/>
-          <w:szCs w:val="21"/>
-        </w:rPr>
-        <w:t xml:space="preserve"> row. Confirm.</w:t>
+        <w:t xml:space="preserve">(as you click Cancel)</w:t>
       </w:r>
     </w:p>
     <w:p>
@@ -1697,7 +1487,7 @@
           <w:sz w:val="22"/>
           <w:szCs w:val="22"/>
         </w:rPr>
-        <w:t xml:space="preserve">“Cancelling a pending transaction updates its status rather than deleting the record — a bank keeps the audit trail. The row stays, marked CANCELLED.”</w:t>
+        <w:t xml:space="preserve">“And cancelling a pending transaction updates its status rather than deleting it. A bank keeps the audit trail, so the row stays, marked CANCELLED.”</w:t>
       </w:r>
     </w:p>
     <w:p>
@@ -1712,7 +1502,7 @@
           <w:sz w:val="26"/>
           <w:szCs w:val="26"/>
         </w:rPr>
-        <w:t xml:space="preserve">6</w:t>
+        <w:t xml:space="preserve">5</w:t>
       </w:r>
       <w:r>
         <w:rPr>
@@ -1731,7 +1521,7 @@
           <w:sz w:val="19"/>
           <w:szCs w:val="19"/>
         </w:rPr>
-        <w:t xml:space="preserve">        1:04 – 1:24</w:t>
+        <w:t xml:space="preserve">        0:50 – 1:08</w:t>
       </w:r>
     </w:p>
     <w:p>
@@ -1854,7 +1644,7 @@
           <w:sz w:val="26"/>
           <w:szCs w:val="26"/>
         </w:rPr>
-        <w:t xml:space="preserve">7</w:t>
+        <w:t xml:space="preserve">6</w:t>
       </w:r>
       <w:r>
         <w:rPr>
@@ -1864,7 +1654,7 @@
           <w:sz w:val="24"/>
           <w:szCs w:val="24"/>
         </w:rPr>
-        <w:t xml:space="preserve">   AI Mode tab</w:t>
+        <w:t xml:space="preserve">   Agentic loop</w:t>
       </w:r>
       <w:r>
         <w:rPr>
@@ -1873,12 +1663,109 @@
           <w:sz w:val="19"/>
           <w:szCs w:val="19"/>
         </w:rPr>
-        <w:t xml:space="preserve">        1:24 – 1:34</w:t>
+        <w:t xml:space="preserve">        1:08 – 1:25</w:t>
       </w:r>
     </w:p>
     <w:p>
       <w:pPr>
         <w:spacing w:after="100"/>
+      </w:pPr>
+      <w:r>
+        <w:rPr>
+          <w:b/>
+          <w:bCs/>
+          <w:color w:val="0A6A4F"/>
+          <w:sz w:val="18"/>
+          <w:szCs w:val="18"/>
+        </w:rPr>
+        <w:t xml:space="preserve">DO   </w:t>
+      </w:r>
+      <w:r>
+        <w:rPr>
+          <w:color w:val="12191C"/>
+          <w:sz w:val="21"/>
+          <w:szCs w:val="21"/>
+        </w:rPr>
+        <w:t xml:space="preserve">Switch to the terminal and run:</w:t>
+      </w:r>
+    </w:p>
+    <w:p>
+      <w:pPr>
+        <w:shd w:fill="EEF2F0" w:val="clear"/>
+        <w:spacing w:after="140" w:before="100"/>
+        <w:ind w:left="431"/>
+      </w:pPr>
+      <w:r>
+        <w:rPr>
+          <w:rFonts w:ascii="Consolas" w:cs="Consolas" w:eastAsia="Consolas" w:hAnsi="Consolas"/>
+          <w:color w:val="0A3D2E"/>
+          <w:sz w:val="19"/>
+          <w:szCs w:val="19"/>
+        </w:rPr>
+        <w:t xml:space="preserve">REVIEW_TARGET=student-5 python agentic_loop.py</w:t>
+      </w:r>
+    </w:p>
+    <w:p>
+      <w:pPr>
+        <w:spacing w:after="100"/>
+      </w:pPr>
+      <w:r>
+        <w:rPr>
+          <w:b/>
+          <w:bCs/>
+          <w:color w:val="0A6A4F"/>
+          <w:sz w:val="18"/>
+          <w:szCs w:val="18"/>
+        </w:rPr>
+        <w:t xml:space="preserve">DO   </w:t>
+      </w:r>
+      <w:r>
+        <w:rPr>
+          <w:color w:val="12191C"/>
+          <w:sz w:val="21"/>
+          <w:szCs w:val="21"/>
+        </w:rPr>
+        <w:t xml:space="preserve">Choose </w:t>
+      </w:r>
+      <w:r>
+        <w:rPr>
+          <w:rFonts w:ascii="Consolas" w:cs="Consolas" w:eastAsia="Consolas" w:hAnsi="Consolas"/>
+          <w:color w:val="12191C"/>
+          <w:sz w:val="20"/>
+          <w:szCs w:val="20"/>
+        </w:rPr>
+        <w:t xml:space="preserve">1</w:t>
+      </w:r>
+      <w:r>
+        <w:rPr>
+          <w:color w:val="12191C"/>
+          <w:sz w:val="21"/>
+          <w:szCs w:val="21"/>
+        </w:rPr>
+        <w:t xml:space="preserve"> (Database). Let the four phases print.</w:t>
+      </w:r>
+    </w:p>
+    <w:p>
+      <w:pPr>
+        <w:pBdr>
+          <w:left w:val="single" w:color="0A6A4F" w:sz="12" w:space="10"/>
+        </w:pBdr>
+        <w:spacing w:after="100" w:line="288"/>
+        <w:ind w:left="431"/>
+      </w:pPr>
+      <w:r>
+        <w:rPr>
+          <w:color w:val="12191C"/>
+          <w:sz w:val="22"/>
+          <w:szCs w:val="22"/>
+        </w:rPr>
+        <w:t xml:space="preserve">“And this is our agentic loop, reviewing my own services. Plan, Act, Observe, Adapt.”</w:t>
+      </w:r>
+    </w:p>
+    <w:p>
+      <w:pPr>
+        <w:spacing w:after="80"/>
+        <w:ind w:left="431"/>
       </w:pPr>
       <w:r>
         <w:rPr>
@@ -1888,83 +1775,7 @@
           <w:sz w:val="19"/>
           <w:szCs w:val="19"/>
         </w:rPr>
-        <w:t xml:space="preserve">Cut this first if you are running long.</w:t>
-      </w:r>
-    </w:p>
-    <w:p>
-      <w:pPr>
-        <w:spacing w:after="100"/>
-      </w:pPr>
-      <w:r>
-        <w:rPr>
-          <w:b/>
-          <w:bCs/>
-          <w:color w:val="0A6A4F"/>
-          <w:sz w:val="18"/>
-          <w:szCs w:val="18"/>
-        </w:rPr>
-        <w:t xml:space="preserve">DO   </w:t>
-      </w:r>
-      <w:r>
-        <w:rPr>
-          <w:color w:val="12191C"/>
-          <w:sz w:val="21"/>
-          <w:szCs w:val="21"/>
-        </w:rPr>
-        <w:t xml:space="preserve">Switch to the </w:t>
-      </w:r>
-      <w:r>
-        <w:rPr>
-          <w:b/>
-          <w:bCs/>
-          <w:color w:val="12191C"/>
-          <w:sz w:val="21"/>
-          <w:szCs w:val="21"/>
-        </w:rPr>
-        <w:t xml:space="preserve">AI Mode</w:t>
-      </w:r>
-      <w:r>
-        <w:rPr>
-          <w:color w:val="12191C"/>
-          <w:sz w:val="21"/>
-          <w:szCs w:val="21"/>
-        </w:rPr>
-        <w:t xml:space="preserve"> tab. Account </w:t>
-      </w:r>
-      <w:r>
-        <w:rPr>
-          <w:rFonts w:ascii="Consolas" w:cs="Consolas" w:eastAsia="Consolas" w:hAnsi="Consolas"/>
-          <w:color w:val="12191C"/>
-          <w:sz w:val="20"/>
-          <w:szCs w:val="20"/>
-        </w:rPr>
-        <w:t xml:space="preserve">1001</w:t>
-      </w:r>
-      <w:r>
-        <w:rPr>
-          <w:color w:val="12191C"/>
-          <w:sz w:val="21"/>
-          <w:szCs w:val="21"/>
-        </w:rPr>
-        <w:t xml:space="preserve">. Click </w:t>
-      </w:r>
-      <w:r>
-        <w:rPr>
-          <w:b/>
-          <w:bCs/>
-          <w:color w:val="12191C"/>
-          <w:sz w:val="21"/>
-          <w:szCs w:val="21"/>
-        </w:rPr>
-        <w:t xml:space="preserve">Summarise this account</w:t>
-      </w:r>
-      <w:r>
-        <w:rPr>
-          <w:color w:val="12191C"/>
-          <w:sz w:val="21"/>
-          <w:szCs w:val="21"/>
-        </w:rPr>
-        <w:t xml:space="preserve">.</w:t>
+        <w:t xml:space="preserve">(as the lines appear)</w:t>
       </w:r>
     </w:p>
     <w:p>
@@ -1981,170 +1792,7 @@
           <w:sz w:val="22"/>
           <w:szCs w:val="22"/>
         </w:rPr>
-        <w:t xml:space="preserve">“The AI Mode tab summarises an account the same way — money in, money out, and the largest single movement.”</w:t>
-      </w:r>
-    </w:p>
-    <w:p>
-      <w:pPr>
-        <w:spacing w:after="120" w:before="300"/>
-      </w:pPr>
-      <w:r>
-        <w:rPr>
-          <w:b/>
-          <w:bCs/>
-          <w:color w:val="0A6A4F"/>
-          <w:sz w:val="26"/>
-          <w:szCs w:val="26"/>
-        </w:rPr>
-        <w:t xml:space="preserve">8</w:t>
-      </w:r>
-      <w:r>
-        <w:rPr>
-          <w:b/>
-          <w:bCs/>
-          <w:color w:val="12191C"/>
-          <w:sz w:val="24"/>
-          <w:szCs w:val="24"/>
-        </w:rPr>
-        <w:t xml:space="preserve">   Agentic loop</w:t>
-      </w:r>
-      <w:r>
-        <w:rPr>
-          <w:rFonts w:ascii="Consolas" w:cs="Consolas" w:eastAsia="Consolas" w:hAnsi="Consolas"/>
-          <w:color w:val="6B7A75"/>
-          <w:sz w:val="19"/>
-          <w:szCs w:val="19"/>
-        </w:rPr>
-        <w:t xml:space="preserve">        1:34 – 1:52</w:t>
-      </w:r>
-    </w:p>
-    <w:p>
-      <w:pPr>
-        <w:spacing w:after="100"/>
-      </w:pPr>
-      <w:r>
-        <w:rPr>
-          <w:b/>
-          <w:bCs/>
-          <w:color w:val="0A6A4F"/>
-          <w:sz w:val="18"/>
-          <w:szCs w:val="18"/>
-        </w:rPr>
-        <w:t xml:space="preserve">DO   </w:t>
-      </w:r>
-      <w:r>
-        <w:rPr>
-          <w:color w:val="12191C"/>
-          <w:sz w:val="21"/>
-          <w:szCs w:val="21"/>
-        </w:rPr>
-        <w:t xml:space="preserve">Switch to the terminal and run:</w:t>
-      </w:r>
-    </w:p>
-    <w:p>
-      <w:pPr>
-        <w:shd w:fill="EEF2F0" w:val="clear"/>
-        <w:spacing w:after="140" w:before="100"/>
-        <w:ind w:left="431"/>
-      </w:pPr>
-      <w:r>
-        <w:rPr>
-          <w:rFonts w:ascii="Consolas" w:cs="Consolas" w:eastAsia="Consolas" w:hAnsi="Consolas"/>
-          <w:color w:val="0A3D2E"/>
-          <w:sz w:val="19"/>
-          <w:szCs w:val="19"/>
-        </w:rPr>
-        <w:t xml:space="preserve">REVIEW_TARGET=student-5 python agentic_loop.py</w:t>
-      </w:r>
-    </w:p>
-    <w:p>
-      <w:pPr>
-        <w:spacing w:after="100"/>
-      </w:pPr>
-      <w:r>
-        <w:rPr>
-          <w:b/>
-          <w:bCs/>
-          <w:color w:val="0A6A4F"/>
-          <w:sz w:val="18"/>
-          <w:szCs w:val="18"/>
-        </w:rPr>
-        <w:t xml:space="preserve">DO   </w:t>
-      </w:r>
-      <w:r>
-        <w:rPr>
-          <w:color w:val="12191C"/>
-          <w:sz w:val="21"/>
-          <w:szCs w:val="21"/>
-        </w:rPr>
-        <w:t xml:space="preserve">Choose </w:t>
-      </w:r>
-      <w:r>
-        <w:rPr>
-          <w:rFonts w:ascii="Consolas" w:cs="Consolas" w:eastAsia="Consolas" w:hAnsi="Consolas"/>
-          <w:color w:val="12191C"/>
-          <w:sz w:val="20"/>
-          <w:szCs w:val="20"/>
-        </w:rPr>
-        <w:t xml:space="preserve">1</w:t>
-      </w:r>
-      <w:r>
-        <w:rPr>
-          <w:color w:val="12191C"/>
-          <w:sz w:val="21"/>
-          <w:szCs w:val="21"/>
-        </w:rPr>
-        <w:t xml:space="preserve"> (Database). Let the four phases print.</w:t>
-      </w:r>
-    </w:p>
-    <w:p>
-      <w:pPr>
-        <w:pBdr>
-          <w:left w:val="single" w:color="0A6A4F" w:sz="12" w:space="10"/>
-        </w:pBdr>
-        <w:spacing w:after="100" w:line="288"/>
-        <w:ind w:left="431"/>
-      </w:pPr>
-      <w:r>
-        <w:rPr>
-          <w:color w:val="12191C"/>
-          <w:sz w:val="22"/>
-          <w:szCs w:val="22"/>
-        </w:rPr>
-        <w:t xml:space="preserve">“And this is our agentic loop, reviewing my own services. Plan, Act, Observe, Adapt.”</w:t>
-      </w:r>
-    </w:p>
-    <w:p>
-      <w:pPr>
-        <w:spacing w:after="80"/>
-        <w:ind w:left="431"/>
-      </w:pPr>
-      <w:r>
-        <w:rPr>
-          <w:i/>
-          <w:iCs/>
-          <w:color w:val="6B7A75"/>
-          <w:sz w:val="19"/>
-          <w:szCs w:val="19"/>
-        </w:rPr>
-        <w:t xml:space="preserve">(as the lines appear)</w:t>
-      </w:r>
-    </w:p>
-    <w:p>
-      <w:pPr>
-        <w:pBdr>
-          <w:left w:val="single" w:color="0A6A4F" w:sz="12" w:space="10"/>
-        </w:pBdr>
-        <w:spacing w:after="100" w:line="288"/>
-        <w:ind w:left="431"/>
-      </w:pPr>
-      <w:r>
-        <w:rPr>
-          <w:color w:val="12191C"/>
-          <w:sz w:val="22"/>
-          <w:szCs w:val="22"/>
-        </w:rPr>
-        <w:t xml:space="preserve">“It gathers real evidence — it executes my schema, counts the seeded rows, and calls my health endpoints. The model only ever sees that evidence, then recommends what to change. Every run is written to a log for the report.”</w:t>
+        <w:t xml:space="preserve">“It gathers real evidence — it executes my schema, counts the seeded rows, calls my health endpoints. The model only ever sees that evidence, then recommends what to change. Every run is logged for the report.”</w:t>
       </w:r>
     </w:p>
     <w:p>
@@ -2168,7 +1816,7 @@
           <w:sz w:val="30"/>
           <w:szCs w:val="30"/>
         </w:rPr>
-        <w:t xml:space="preserve">If you are over time</w:t>
+        <w:t xml:space="preserve">If you are still over time</w:t>
       </w:r>
     </w:p>
     <w:p>
@@ -2181,7 +1829,25 @@
           <w:sz w:val="21"/>
           <w:szCs w:val="21"/>
         </w:rPr>
-        <w:t xml:space="preserve">Cut in this order:</w:t>
+        <w:t xml:space="preserve">This script is already cut to 85 seconds. The old beat 7 (the AI Mode summary tab) and the type filter are gone — </w:t>
+      </w:r>
+      <w:r>
+        <w:rPr>
+          <w:b/>
+          <w:bCs/>
+          <w:color w:val="12191C"/>
+          <w:sz w:val="21"/>
+          <w:szCs w:val="21"/>
+        </w:rPr>
+        <w:t xml:space="preserve">Explain</w:t>
+      </w:r>
+      <w:r>
+        <w:rPr>
+          <w:color w:val="12191C"/>
+          <w:sz w:val="21"/>
+          <w:szCs w:val="21"/>
+        </w:rPr>
+        <w:t xml:space="preserve"> already proves AI-Mode, so the tab was evidence you were paying for twice. If you still run long, cut in this order:</w:t>
       </w:r>
     </w:p>
     <w:p>
@@ -2199,7 +1865,7 @@
           <w:sz w:val="21"/>
           <w:szCs w:val="21"/>
         </w:rPr>
-        <w:t xml:space="preserve">Beat 7 (AI Mode tab) — Explain has already proved AI-Mode</w:t>
+        <w:t xml:space="preserve">The over-limit transfer in beat 4 — say the rule instead of demonstrating it</w:t>
       </w:r>
     </w:p>
     <w:p>
@@ -2217,25 +1883,7 @@
           <w:sz w:val="21"/>
           <w:szCs w:val="21"/>
         </w:rPr>
-        <w:t xml:space="preserve">The filter in beat 2</w:t>
-      </w:r>
-    </w:p>
-    <w:p>
-      <w:pPr>
-        <w:pStyle w:val="ListParagraph"/>
-        <w:numPr>
-          <w:ilvl w:val="0"/>
-          <w:numId w:val="2"/>
-        </w:numPr>
-        <w:spacing w:after="70"/>
-      </w:pPr>
-      <w:r>
-        <w:rPr>
-          <w:color w:val="12191C"/>
-          <w:sz w:val="21"/>
-          <w:szCs w:val="21"/>
-        </w:rPr>
-        <w:t xml:space="preserve">Beat 4 (over-limit transfer) — mention it verbally instead</w:t>
+        <w:t xml:space="preserve">The second spoken line in beat 3 — shorten to “validated against Binh’s Account service”</w:t>
       </w:r>
     </w:p>
     <w:p>
@@ -2250,7 +1898,7 @@
           <w:sz w:val="21"/>
           <w:szCs w:val="21"/>
         </w:rPr>
-        <w:t xml:space="preserve">Never cut beats 1, 3, 6 and 8. </w:t>
+        <w:t xml:space="preserve">Never cut beats 1, 3, 5 and 6. </w:t>
       </w:r>
       <w:r>
         <w:rPr>
@@ -2359,6 +2007,1161 @@
           <w:szCs w:val="21"/>
         </w:rPr>
         <w:t xml:space="preserve">Do not debug on camera. Stop, fix it, and re-record the segment. It is one take of ninety seconds.</w:t>
+      </w:r>
+    </w:p>
+    <w:p>
+      <w:pPr>
+        <w:pageBreakBefore/>
+      </w:pPr>
+    </w:p>
+    <w:p>
+      <w:pPr>
+        <w:pStyle w:val="Heading1"/>
+        <w:spacing w:after="140" w:before="360"/>
+      </w:pPr>
+      <w:r>
+        <w:rPr>
+          <w:b/>
+          <w:bCs/>
+          <w:color w:val="12191C"/>
+          <w:sz w:val="30"/>
+          <w:szCs w:val="30"/>
+        </w:rPr>
+        <w:t xml:space="preserve">Group segments</w:t>
+      </w:r>
+    </w:p>
+    <w:p>
+      <w:pPr>
+        <w:spacing w:after="240" w:line="276"/>
+      </w:pPr>
+      <w:r>
+        <w:rPr>
+          <w:color w:val="12191C"/>
+          <w:sz w:val="21"/>
+          <w:szCs w:val="21"/>
+        </w:rPr>
+        <w:t xml:space="preserve">These two are required of the video as a whole, not of each student: </w:t>
+      </w:r>
+      <w:r>
+        <w:rPr>
+          <w:i/>
+          <w:iCs/>
+          <w:color w:val="12191C"/>
+          <w:sz w:val="21"/>
+          <w:szCs w:val="21"/>
+        </w:rPr>
+        <w:t xml:space="preserve">“The video must also include demonstration of deployment steps, AI-agentic workflow execution, and CICD pipeline.”</w:t>
+      </w:r>
+      <w:r>
+        <w:rPr>
+          <w:color w:val="12191C"/>
+          <w:sz w:val="21"/>
+          <w:szCs w:val="21"/>
+        </w:rPr>
+        <w:t xml:space="preserve"> Agree with the team who presents each one — they are not part of anybody’s 85 seconds.</w:t>
+      </w:r>
+    </w:p>
+    <w:p>
+      <w:pPr>
+        <w:spacing w:after="120" w:before="300"/>
+      </w:pPr>
+      <w:r>
+        <w:rPr>
+          <w:b/>
+          <w:bCs/>
+          <w:color w:val="0A6A4F"/>
+          <w:sz w:val="26"/>
+          <w:szCs w:val="26"/>
+        </w:rPr>
+        <w:t xml:space="preserve">O</w:t>
+      </w:r>
+      <w:r>
+        <w:rPr>
+          <w:b/>
+          <w:bCs/>
+          <w:color w:val="12191C"/>
+          <w:sz w:val="24"/>
+          <w:szCs w:val="24"/>
+        </w:rPr>
+        <w:t xml:space="preserve">   Opening</w:t>
+      </w:r>
+      <w:r>
+        <w:rPr>
+          <w:rFonts w:ascii="Consolas" w:cs="Consolas" w:eastAsia="Consolas" w:hAnsi="Consolas"/>
+          <w:color w:val="6B7A75"/>
+          <w:sz w:val="19"/>
+          <w:szCs w:val="19"/>
+        </w:rPr>
+        <w:t xml:space="preserve">        ≈ 40 seconds</w:t>
+      </w:r>
+    </w:p>
+    <w:p>
+      <w:pPr>
+        <w:spacing w:after="120"/>
+      </w:pPr>
+      <w:r>
+        <w:rPr>
+          <w:i/>
+          <w:iCs/>
+          <w:color w:val="6B7A75"/>
+          <w:sz w:val="19"/>
+          <w:szCs w:val="19"/>
+        </w:rPr>
+        <w:t xml:space="preserve">Open on the running application, not on a slide. A title card costs you the first impression.</w:t>
+      </w:r>
+    </w:p>
+    <w:p>
+      <w:pPr>
+        <w:spacing w:after="100"/>
+      </w:pPr>
+      <w:r>
+        <w:rPr>
+          <w:b/>
+          <w:bCs/>
+          <w:color w:val="0A6A4F"/>
+          <w:sz w:val="18"/>
+          <w:szCs w:val="18"/>
+        </w:rPr>
+        <w:t xml:space="preserve">DO   </w:t>
+      </w:r>
+      <w:r>
+        <w:rPr>
+          <w:color w:val="12191C"/>
+          <w:sz w:val="21"/>
+          <w:szCs w:val="21"/>
+        </w:rPr>
+        <w:t xml:space="preserve">Screen already showing the shared dashboard at </w:t>
+      </w:r>
+      <w:r>
+        <w:rPr>
+          <w:rFonts w:ascii="Consolas" w:cs="Consolas" w:eastAsia="Consolas" w:hAnsi="Consolas"/>
+          <w:color w:val="12191C"/>
+          <w:sz w:val="20"/>
+          <w:szCs w:val="20"/>
+        </w:rPr>
+        <w:t xml:space="preserve">localhost:8080</w:t>
+      </w:r>
+      <w:r>
+        <w:rPr>
+          <w:color w:val="12191C"/>
+          <w:sz w:val="21"/>
+          <w:szCs w:val="21"/>
+        </w:rPr>
+        <w:t xml:space="preserve">. One person narrates — whoever is most comfortable speaking.</w:t>
+      </w:r>
+    </w:p>
+    <w:p>
+      <w:pPr>
+        <w:pBdr>
+          <w:left w:val="single" w:color="0A6A4F" w:sz="12" w:space="10"/>
+        </w:pBdr>
+        <w:spacing w:after="100" w:line="288"/>
+        <w:ind w:left="431"/>
+      </w:pPr>
+      <w:r>
+        <w:rPr>
+          <w:color w:val="12191C"/>
+          <w:sz w:val="22"/>
+          <w:szCs w:val="22"/>
+        </w:rPr>
+        <w:t xml:space="preserve">“This is Group 44’s Release 0 for Agentic Software Development. We’ve built an agentic AI banking application as five integrated microservice feature sets.”</w:t>
+      </w:r>
+    </w:p>
+    <w:p>
+      <w:pPr>
+        <w:spacing w:after="100"/>
+      </w:pPr>
+      <w:r>
+        <w:rPr>
+          <w:b/>
+          <w:bCs/>
+          <w:color w:val="0A6A4F"/>
+          <w:sz w:val="18"/>
+          <w:szCs w:val="18"/>
+        </w:rPr>
+        <w:t xml:space="preserve">DO   </w:t>
+      </w:r>
+      <w:r>
+        <w:rPr>
+          <w:color w:val="12191C"/>
+          <w:sz w:val="21"/>
+          <w:szCs w:val="21"/>
+        </w:rPr>
+        <w:t xml:space="preserve">Move the cursor slowly across the nav: Dashboard, Accounts, Transactions, Cards, Notifications, Profile.</w:t>
+      </w:r>
+    </w:p>
+    <w:p>
+      <w:pPr>
+        <w:pBdr>
+          <w:left w:val="single" w:color="0A6A4F" w:sz="12" w:space="10"/>
+        </w:pBdr>
+        <w:spacing w:after="100" w:line="288"/>
+        <w:ind w:left="431"/>
+      </w:pPr>
+      <w:r>
+        <w:rPr>
+          <w:color w:val="12191C"/>
+          <w:sz w:val="22"/>
+          <w:szCs w:val="22"/>
+        </w:rPr>
+        <w:t xml:space="preserve">“This is our shared home page — one containerised entry point that routes to all five student frontends. Behind it, each of us owns three containers: a frontend, a backend API, and a SQLite database service. No feature opens another feature’s database file; it goes through that feature’s API.”</w:t>
+      </w:r>
+    </w:p>
+    <w:p>
+      <w:pPr>
+        <w:spacing w:after="100"/>
+      </w:pPr>
+      <w:r>
+        <w:rPr>
+          <w:b/>
+          <w:bCs/>
+          <w:color w:val="0A6A4F"/>
+          <w:sz w:val="18"/>
+          <w:szCs w:val="18"/>
+        </w:rPr>
+        <w:t xml:space="preserve">DO   </w:t>
+      </w:r>
+      <w:r>
+        <w:rPr>
+          <w:color w:val="12191C"/>
+          <w:sz w:val="21"/>
+          <w:szCs w:val="21"/>
+        </w:rPr>
+        <w:t xml:space="preserve">Point at the service status strip in the footer.</w:t>
+      </w:r>
+    </w:p>
+    <w:p>
+      <w:pPr>
+        <w:pBdr>
+          <w:left w:val="single" w:color="0A6A4F" w:sz="12" w:space="10"/>
+        </w:pBdr>
+        <w:spacing w:after="100" w:line="288"/>
+        <w:ind w:left="431"/>
+      </w:pPr>
+      <w:r>
+        <w:rPr>
+          <w:color w:val="12191C"/>
+          <w:sz w:val="22"/>
+          <w:szCs w:val="22"/>
+        </w:rPr>
+        <w:t xml:space="preserve">“Everything you’ll see is running right now under one Docker Compose file, with a shared Ollama runtime serving AI-Mode to all five backends.”</w:t>
+      </w:r>
+    </w:p>
+    <w:p>
+      <w:pPr>
+        <w:pBdr>
+          <w:left w:val="single" w:color="0A6A4F" w:sz="12" w:space="10"/>
+        </w:pBdr>
+        <w:spacing w:after="100" w:line="288"/>
+        <w:ind w:left="431"/>
+      </w:pPr>
+      <w:r>
+        <w:rPr>
+          <w:color w:val="12191C"/>
+          <w:sz w:val="22"/>
+          <w:szCs w:val="22"/>
+        </w:rPr>
+        <w:t xml:space="preserve">“Over the next ten minutes each of us will demonstrate our own feature and its AI-Mode integration, then we’ll show the deployment steps, the agentic loop running in the terminal, and our CI/CD pipeline on GitHub Actions. Starting with Card Management — over to Juno.”</w:t>
+      </w:r>
+    </w:p>
+    <w:p>
+      <w:pPr>
+        <w:spacing w:after="120" w:before="300"/>
+      </w:pPr>
+      <w:r>
+        <w:rPr>
+          <w:b/>
+          <w:bCs/>
+          <w:color w:val="0A6A4F"/>
+          <w:sz w:val="26"/>
+          <w:szCs w:val="26"/>
+        </w:rPr>
+        <w:t xml:space="preserve">A</w:t>
+      </w:r>
+      <w:r>
+        <w:rPr>
+          <w:b/>
+          <w:bCs/>
+          <w:color w:val="12191C"/>
+          <w:sz w:val="24"/>
+          <w:szCs w:val="24"/>
+        </w:rPr>
+        <w:t xml:space="preserve">   Deployment steps</w:t>
+      </w:r>
+      <w:r>
+        <w:rPr>
+          <w:rFonts w:ascii="Consolas" w:cs="Consolas" w:eastAsia="Consolas" w:hAnsi="Consolas"/>
+          <w:color w:val="6B7A75"/>
+          <w:sz w:val="19"/>
+          <w:szCs w:val="19"/>
+        </w:rPr>
+        <w:t xml:space="preserve">        ≈ 55 seconds</w:t>
+      </w:r>
+    </w:p>
+    <w:p>
+      <w:pPr>
+        <w:spacing w:after="120"/>
+      </w:pPr>
+      <w:r>
+        <w:rPr>
+          <w:i/>
+          <w:iCs/>
+          <w:color w:val="6B7A75"/>
+          <w:sz w:val="19"/>
+          <w:szCs w:val="19"/>
+        </w:rPr>
+        <w:t xml:space="preserve">Build the images before recording. Never build on camera.</w:t>
+      </w:r>
+    </w:p>
+    <w:p>
+      <w:pPr>
+        <w:spacing w:after="100"/>
+      </w:pPr>
+      <w:r>
+        <w:rPr>
+          <w:b/>
+          <w:bCs/>
+          <w:color w:val="0A6A4F"/>
+          <w:sz w:val="18"/>
+          <w:szCs w:val="18"/>
+        </w:rPr>
+        <w:t xml:space="preserve">DO   </w:t>
+      </w:r>
+      <w:r>
+        <w:rPr>
+          <w:color w:val="12191C"/>
+          <w:sz w:val="21"/>
+          <w:szCs w:val="21"/>
+        </w:rPr>
+        <w:t xml:space="preserve">Terminal at the repository root.</w:t>
+      </w:r>
+    </w:p>
+    <w:p>
+      <w:pPr>
+        <w:pBdr>
+          <w:left w:val="single" w:color="0A6A4F" w:sz="12" w:space="10"/>
+        </w:pBdr>
+        <w:spacing w:after="100" w:line="288"/>
+        <w:ind w:left="431"/>
+      </w:pPr>
+      <w:r>
+        <w:rPr>
+          <w:color w:val="12191C"/>
+          <w:sz w:val="22"/>
+          <w:szCs w:val="22"/>
+        </w:rPr>
+        <w:t xml:space="preserve">“One shared repository, and one Docker Compose file that runs the whole application.”</w:t>
+      </w:r>
+    </w:p>
+    <w:p>
+      <w:pPr>
+        <w:spacing w:after="100"/>
+      </w:pPr>
+      <w:r>
+        <w:rPr>
+          <w:b/>
+          <w:bCs/>
+          <w:color w:val="0A6A4F"/>
+          <w:sz w:val="18"/>
+          <w:szCs w:val="18"/>
+        </w:rPr>
+        <w:t xml:space="preserve">DO   </w:t>
+      </w:r>
+      <w:r>
+        <w:rPr>
+          <w:color w:val="12191C"/>
+          <w:sz w:val="21"/>
+          <w:szCs w:val="21"/>
+        </w:rPr>
+        <w:t xml:space="preserve">Show the top of the compose file:</w:t>
+      </w:r>
+    </w:p>
+    <w:p>
+      <w:pPr>
+        <w:shd w:fill="EEF2F0" w:val="clear"/>
+        <w:spacing w:after="140" w:before="100"/>
+        <w:ind w:left="431"/>
+      </w:pPr>
+      <w:r>
+        <w:rPr>
+          <w:rFonts w:ascii="Consolas" w:cs="Consolas" w:eastAsia="Consolas" w:hAnsi="Consolas"/>
+          <w:color w:val="0A3D2E"/>
+          <w:sz w:val="19"/>
+          <w:szCs w:val="19"/>
+        </w:rPr>
+        <w:t xml:space="preserve">head -25 docker-compose.yml</w:t>
+      </w:r>
+    </w:p>
+    <w:p>
+      <w:pPr>
+        <w:pBdr>
+          <w:left w:val="single" w:color="0A6A4F" w:sz="12" w:space="10"/>
+        </w:pBdr>
+        <w:spacing w:after="100" w:line="288"/>
+        <w:ind w:left="431"/>
+      </w:pPr>
+      <w:r>
+        <w:rPr>
+          <w:color w:val="12191C"/>
+          <w:sz w:val="22"/>
+          <w:szCs w:val="22"/>
+        </w:rPr>
+        <w:t xml:space="preserve">“Every container listens on port 8000 inside the Docker network. The published host ports follow a team convention — frontend 810N, backend 820N, database 830N, where N is the student number.”</w:t>
+      </w:r>
+    </w:p>
+    <w:p>
+      <w:pPr>
+        <w:spacing w:after="100"/>
+      </w:pPr>
+      <w:r>
+        <w:rPr>
+          <w:b/>
+          <w:bCs/>
+          <w:color w:val="0A6A4F"/>
+          <w:sz w:val="18"/>
+          <w:szCs w:val="18"/>
+        </w:rPr>
+        <w:t xml:space="preserve">DO   </w:t>
+      </w:r>
+      <w:r>
+        <w:rPr>
+          <w:color w:val="12191C"/>
+          <w:sz w:val="21"/>
+          <w:szCs w:val="21"/>
+        </w:rPr>
+        <w:t xml:space="preserve">Start the application:</w:t>
+      </w:r>
+    </w:p>
+    <w:p>
+      <w:pPr>
+        <w:shd w:fill="EEF2F0" w:val="clear"/>
+        <w:spacing w:after="140" w:before="100"/>
+        <w:ind w:left="431"/>
+      </w:pPr>
+      <w:r>
+        <w:rPr>
+          <w:rFonts w:ascii="Consolas" w:cs="Consolas" w:eastAsia="Consolas" w:hAnsi="Consolas"/>
+          <w:color w:val="0A3D2E"/>
+          <w:sz w:val="19"/>
+          <w:szCs w:val="19"/>
+        </w:rPr>
+        <w:t xml:space="preserve">docker compose up -d</w:t>
+      </w:r>
+    </w:p>
+    <w:p>
+      <w:pPr>
+        <w:pBdr>
+          <w:left w:val="single" w:color="0A6A4F" w:sz="12" w:space="10"/>
+        </w:pBdr>
+        <w:spacing w:after="100" w:line="288"/>
+        <w:ind w:left="431"/>
+      </w:pPr>
+      <w:r>
+        <w:rPr>
+          <w:color w:val="12191C"/>
+          <w:sz w:val="22"/>
+          <w:szCs w:val="22"/>
+        </w:rPr>
+        <w:t xml:space="preserve">“One command starts all five feature sets, the shared home page, and Ollama.”</w:t>
+      </w:r>
+    </w:p>
+    <w:p>
+      <w:pPr>
+        <w:spacing w:after="100"/>
+      </w:pPr>
+      <w:r>
+        <w:rPr>
+          <w:b/>
+          <w:bCs/>
+          <w:color w:val="0A6A4F"/>
+          <w:sz w:val="18"/>
+          <w:szCs w:val="18"/>
+        </w:rPr>
+        <w:t xml:space="preserve">DO   </w:t>
+      </w:r>
+      <w:r>
+        <w:rPr>
+          <w:color w:val="12191C"/>
+          <w:sz w:val="21"/>
+          <w:szCs w:val="21"/>
+        </w:rPr>
+        <w:t xml:space="preserve">Then:</w:t>
+      </w:r>
+    </w:p>
+    <w:p>
+      <w:pPr>
+        <w:shd w:fill="EEF2F0" w:val="clear"/>
+        <w:spacing w:after="140" w:before="100"/>
+        <w:ind w:left="431"/>
+      </w:pPr>
+      <w:r>
+        <w:rPr>
+          <w:rFonts w:ascii="Consolas" w:cs="Consolas" w:eastAsia="Consolas" w:hAnsi="Consolas"/>
+          <w:color w:val="0A3D2E"/>
+          <w:sz w:val="19"/>
+          <w:szCs w:val="19"/>
+        </w:rPr>
+        <w:t xml:space="preserve">docker compose ps</w:t>
+      </w:r>
+    </w:p>
+    <w:p>
+      <w:pPr>
+        <w:pBdr>
+          <w:left w:val="single" w:color="0A6A4F" w:sz="12" w:space="10"/>
+        </w:pBdr>
+        <w:spacing w:after="100" w:line="288"/>
+        <w:ind w:left="431"/>
+      </w:pPr>
+      <w:r>
+        <w:rPr>
+          <w:color w:val="12191C"/>
+          <w:sz w:val="22"/>
+          <w:szCs w:val="22"/>
+        </w:rPr>
+        <w:t xml:space="preserve">“Every container is up — five frontends, five backends, five databases, the shared index, and the model runtime.”</w:t>
+      </w:r>
+    </w:p>
+    <w:p>
+      <w:pPr>
+        <w:spacing w:after="100"/>
+      </w:pPr>
+      <w:r>
+        <w:rPr>
+          <w:b/>
+          <w:bCs/>
+          <w:color w:val="0A6A4F"/>
+          <w:sz w:val="18"/>
+          <w:szCs w:val="18"/>
+        </w:rPr>
+        <w:t xml:space="preserve">DO   </w:t>
+      </w:r>
+      <w:r>
+        <w:rPr>
+          <w:color w:val="12191C"/>
+          <w:sz w:val="21"/>
+          <w:szCs w:val="21"/>
+        </w:rPr>
+        <w:t xml:space="preserve">Open </w:t>
+      </w:r>
+      <w:r>
+        <w:rPr>
+          <w:rFonts w:ascii="Consolas" w:cs="Consolas" w:eastAsia="Consolas" w:hAnsi="Consolas"/>
+          <w:color w:val="12191C"/>
+          <w:sz w:val="20"/>
+          <w:szCs w:val="20"/>
+        </w:rPr>
+        <w:t xml:space="preserve">localhost:8080</w:t>
+      </w:r>
+      <w:r>
+        <w:rPr>
+          <w:color w:val="12191C"/>
+          <w:sz w:val="21"/>
+          <w:szCs w:val="21"/>
+        </w:rPr>
+        <w:t xml:space="preserve"> in the browser.</w:t>
+      </w:r>
+    </w:p>
+    <w:p>
+      <w:pPr>
+        <w:pBdr>
+          <w:left w:val="single" w:color="0A6A4F" w:sz="12" w:space="10"/>
+        </w:pBdr>
+        <w:spacing w:after="100" w:line="288"/>
+        <w:ind w:left="431"/>
+      </w:pPr>
+      <w:r>
+        <w:rPr>
+          <w:color w:val="12191C"/>
+          <w:sz w:val="22"/>
+          <w:szCs w:val="22"/>
+        </w:rPr>
+        <w:t xml:space="preserve">“The shared HTMX index is the single entry point to all five features. The status strip at the bottom calls each backend’s health endpoint, so we can see the whole system responding.”</w:t>
+      </w:r>
+    </w:p>
+    <w:p>
+      <w:pPr>
+        <w:pBdr>
+          <w:bottom w:val="single" w:color="D8DDDA" w:sz="6" w:space="1"/>
+        </w:pBdr>
+        <w:spacing w:after="160" w:before="160"/>
+      </w:pPr>
+    </w:p>
+    <w:p>
+      <w:pPr>
+        <w:spacing w:after="120" w:before="300"/>
+      </w:pPr>
+      <w:r>
+        <w:rPr>
+          <w:b/>
+          <w:bCs/>
+          <w:color w:val="0A6A4F"/>
+          <w:sz w:val="26"/>
+          <w:szCs w:val="26"/>
+        </w:rPr>
+        <w:t xml:space="preserve">B</w:t>
+      </w:r>
+      <w:r>
+        <w:rPr>
+          <w:b/>
+          <w:bCs/>
+          <w:color w:val="12191C"/>
+          <w:sz w:val="24"/>
+          <w:szCs w:val="24"/>
+        </w:rPr>
+        <w:t xml:space="preserve">   CI/CD pipeline</w:t>
+      </w:r>
+      <w:r>
+        <w:rPr>
+          <w:rFonts w:ascii="Consolas" w:cs="Consolas" w:eastAsia="Consolas" w:hAnsi="Consolas"/>
+          <w:color w:val="6B7A75"/>
+          <w:sz w:val="19"/>
+          <w:szCs w:val="19"/>
+        </w:rPr>
+        <w:t xml:space="preserve">        ≈ 65 seconds</w:t>
+      </w:r>
+    </w:p>
+    <w:p>
+      <w:pPr>
+        <w:spacing w:after="120"/>
+      </w:pPr>
+      <w:r>
+        <w:rPr>
+          <w:i/>
+          <w:iCs/>
+          <w:color w:val="6B7A75"/>
+          <w:sz w:val="19"/>
+          <w:szCs w:val="19"/>
+        </w:rPr>
+        <w:t xml:space="preserve">Trigger the workflow ten minutes before recording so a green run is ready. Do not push and wait on camera.</w:t>
+      </w:r>
+    </w:p>
+    <w:p>
+      <w:pPr>
+        <w:spacing w:after="100"/>
+      </w:pPr>
+      <w:r>
+        <w:rPr>
+          <w:b/>
+          <w:bCs/>
+          <w:color w:val="0A6A4F"/>
+          <w:sz w:val="18"/>
+          <w:szCs w:val="18"/>
+        </w:rPr>
+        <w:t xml:space="preserve">DO   </w:t>
+      </w:r>
+      <w:r>
+        <w:rPr>
+          <w:color w:val="12191C"/>
+          <w:sz w:val="21"/>
+          <w:szCs w:val="21"/>
+        </w:rPr>
+        <w:t xml:space="preserve">Open </w:t>
+      </w:r>
+      <w:r>
+        <w:rPr>
+          <w:rFonts w:ascii="Consolas" w:cs="Consolas" w:eastAsia="Consolas" w:hAnsi="Consolas"/>
+          <w:color w:val="12191C"/>
+          <w:sz w:val="20"/>
+          <w:szCs w:val="20"/>
+        </w:rPr>
+        <w:t xml:space="preserve">.github/workflows/</w:t>
+      </w:r>
+      <w:r>
+        <w:rPr>
+          <w:color w:val="12191C"/>
+          <w:sz w:val="21"/>
+          <w:szCs w:val="21"/>
+        </w:rPr>
+        <w:t xml:space="preserve"> in the editor, showing the five files.</w:t>
+      </w:r>
+    </w:p>
+    <w:p>
+      <w:pPr>
+        <w:pBdr>
+          <w:left w:val="single" w:color="0A6A4F" w:sz="12" w:space="10"/>
+        </w:pBdr>
+        <w:spacing w:after="100" w:line="288"/>
+        <w:ind w:left="431"/>
+      </w:pPr>
+      <w:r>
+        <w:rPr>
+          <w:color w:val="12191C"/>
+          <w:sz w:val="22"/>
+          <w:szCs w:val="22"/>
+        </w:rPr>
+        <w:t xml:space="preserve">“Each student maintains their own workflow file, student-1 through student-5, as the specification requires.”</w:t>
+      </w:r>
+    </w:p>
+    <w:p>
+      <w:pPr>
+        <w:spacing w:after="100"/>
+      </w:pPr>
+      <w:r>
+        <w:rPr>
+          <w:b/>
+          <w:bCs/>
+          <w:color w:val="0A6A4F"/>
+          <w:sz w:val="18"/>
+          <w:szCs w:val="18"/>
+        </w:rPr>
+        <w:t xml:space="preserve">DO   </w:t>
+      </w:r>
+      <w:r>
+        <w:rPr>
+          <w:color w:val="12191C"/>
+          <w:sz w:val="21"/>
+          <w:szCs w:val="21"/>
+        </w:rPr>
+        <w:t xml:space="preserve">Open </w:t>
+      </w:r>
+      <w:r>
+        <w:rPr>
+          <w:rFonts w:ascii="Consolas" w:cs="Consolas" w:eastAsia="Consolas" w:hAnsi="Consolas"/>
+          <w:color w:val="12191C"/>
+          <w:sz w:val="20"/>
+          <w:szCs w:val="20"/>
+        </w:rPr>
+        <w:t xml:space="preserve">student-5.yml</w:t>
+      </w:r>
+      <w:r>
+        <w:rPr>
+          <w:color w:val="12191C"/>
+          <w:sz w:val="21"/>
+          <w:szCs w:val="21"/>
+        </w:rPr>
+        <w:t xml:space="preserve">. Point at the three jobs.</w:t>
+      </w:r>
+    </w:p>
+    <w:p>
+      <w:pPr>
+        <w:pBdr>
+          <w:left w:val="single" w:color="0A6A4F" w:sz="12" w:space="10"/>
+        </w:pBdr>
+        <w:spacing w:after="100" w:line="288"/>
+        <w:ind w:left="431"/>
+      </w:pPr>
+      <w:r>
+        <w:rPr>
+          <w:color w:val="12191C"/>
+          <w:sz w:val="22"/>
+          <w:szCs w:val="22"/>
+        </w:rPr>
+        <w:t xml:space="preserve">“Mine has three stages: tests, build and smoke test, and an evidence pack. It builds only the student-5 services, so another feature failing to build does not turn my workflow red.”</w:t>
+      </w:r>
+    </w:p>
+    <w:p>
+      <w:pPr>
+        <w:spacing w:after="100"/>
+      </w:pPr>
+      <w:r>
+        <w:rPr>
+          <w:b/>
+          <w:bCs/>
+          <w:color w:val="0A6A4F"/>
+          <w:sz w:val="18"/>
+          <w:szCs w:val="18"/>
+        </w:rPr>
+        <w:t xml:space="preserve">DO   </w:t>
+      </w:r>
+      <w:r>
+        <w:rPr>
+          <w:color w:val="12191C"/>
+          <w:sz w:val="21"/>
+          <w:szCs w:val="21"/>
+        </w:rPr>
+        <w:t xml:space="preserve">Switch to GitHub, the </w:t>
+      </w:r>
+      <w:r>
+        <w:rPr>
+          <w:b/>
+          <w:bCs/>
+          <w:color w:val="12191C"/>
+          <w:sz w:val="21"/>
+          <w:szCs w:val="21"/>
+        </w:rPr>
+        <w:t xml:space="preserve">Actions</w:t>
+      </w:r>
+      <w:r>
+        <w:rPr>
+          <w:color w:val="12191C"/>
+          <w:sz w:val="21"/>
+          <w:szCs w:val="21"/>
+        </w:rPr>
+        <w:t xml:space="preserve"> tab.</w:t>
+      </w:r>
+    </w:p>
+    <w:p>
+      <w:pPr>
+        <w:pBdr>
+          <w:left w:val="single" w:color="0A6A4F" w:sz="12" w:space="10"/>
+        </w:pBdr>
+        <w:spacing w:after="100" w:line="288"/>
+        <w:ind w:left="431"/>
+      </w:pPr>
+      <w:r>
+        <w:rPr>
+          <w:color w:val="12191C"/>
+          <w:sz w:val="22"/>
+          <w:szCs w:val="22"/>
+        </w:rPr>
+        <w:t xml:space="preserve">“Every push that touches student-5 triggers it. This is run number forty-two, so the history follows our commits rather than being run once before submission.”</w:t>
+      </w:r>
+    </w:p>
+    <w:p>
+      <w:pPr>
+        <w:spacing w:after="100"/>
+      </w:pPr>
+      <w:r>
+        <w:rPr>
+          <w:b/>
+          <w:bCs/>
+          <w:color w:val="0A6A4F"/>
+          <w:sz w:val="18"/>
+          <w:szCs w:val="18"/>
+        </w:rPr>
+        <w:t xml:space="preserve">DO   </w:t>
+      </w:r>
+      <w:r>
+        <w:rPr>
+          <w:color w:val="12191C"/>
+          <w:sz w:val="21"/>
+          <w:szCs w:val="21"/>
+        </w:rPr>
+        <w:t xml:space="preserve">Open a green run. Expand </w:t>
+      </w:r>
+      <w:r>
+        <w:rPr>
+          <w:b/>
+          <w:bCs/>
+          <w:color w:val="12191C"/>
+          <w:sz w:val="21"/>
+          <w:szCs w:val="21"/>
+        </w:rPr>
+        <w:t xml:space="preserve">Tests</w:t>
+      </w:r>
+      <w:r>
+        <w:rPr>
+          <w:color w:val="12191C"/>
+          <w:sz w:val="21"/>
+          <w:szCs w:val="21"/>
+        </w:rPr>
+        <w:t xml:space="preserve"> → </w:t>
+      </w:r>
+      <w:r>
+        <w:rPr>
+          <w:b/>
+          <w:bCs/>
+          <w:color w:val="12191C"/>
+          <w:sz w:val="21"/>
+          <w:szCs w:val="21"/>
+        </w:rPr>
+        <w:t xml:space="preserve">Run pytest</w:t>
+      </w:r>
+      <w:r>
+        <w:rPr>
+          <w:color w:val="12191C"/>
+          <w:sz w:val="21"/>
+          <w:szCs w:val="21"/>
+        </w:rPr>
+        <w:t xml:space="preserve">.</w:t>
+      </w:r>
+    </w:p>
+    <w:p>
+      <w:pPr>
+        <w:pBdr>
+          <w:left w:val="single" w:color="0A6A4F" w:sz="12" w:space="10"/>
+        </w:pBdr>
+        <w:spacing w:after="100" w:line="288"/>
+        <w:ind w:left="431"/>
+      </w:pPr>
+      <w:r>
+        <w:rPr>
+          <w:color w:val="12191C"/>
+          <w:sz w:val="22"/>
+          <w:szCs w:val="22"/>
+        </w:rPr>
+        <w:t xml:space="preserve">“Sixty-five unit and integration tests, running in about two seconds with no containers needed.”</w:t>
+      </w:r>
+    </w:p>
+    <w:p>
+      <w:pPr>
+        <w:spacing w:after="100"/>
+      </w:pPr>
+      <w:r>
+        <w:rPr>
+          <w:b/>
+          <w:bCs/>
+          <w:color w:val="0A6A4F"/>
+          <w:sz w:val="18"/>
+          <w:szCs w:val="18"/>
+        </w:rPr>
+        <w:t xml:space="preserve">DO   </w:t>
+      </w:r>
+      <w:r>
+        <w:rPr>
+          <w:color w:val="12191C"/>
+          <w:sz w:val="21"/>
+          <w:szCs w:val="21"/>
+        </w:rPr>
+        <w:t xml:space="preserve">Expand </w:t>
+      </w:r>
+      <w:r>
+        <w:rPr>
+          <w:b/>
+          <w:bCs/>
+          <w:color w:val="12191C"/>
+          <w:sz w:val="21"/>
+          <w:szCs w:val="21"/>
+        </w:rPr>
+        <w:t xml:space="preserve">Build and smoke test</w:t>
+      </w:r>
+      <w:r>
+        <w:rPr>
+          <w:color w:val="12191C"/>
+          <w:sz w:val="21"/>
+          <w:szCs w:val="21"/>
+        </w:rPr>
+        <w:t xml:space="preserve"> → </w:t>
+      </w:r>
+      <w:r>
+        <w:rPr>
+          <w:b/>
+          <w:bCs/>
+          <w:color w:val="12191C"/>
+          <w:sz w:val="21"/>
+          <w:szCs w:val="21"/>
+        </w:rPr>
+        <w:t xml:space="preserve">Smoke checks</w:t>
+      </w:r>
+      <w:r>
+        <w:rPr>
+          <w:color w:val="12191C"/>
+          <w:sz w:val="21"/>
+          <w:szCs w:val="21"/>
+        </w:rPr>
+        <w:t xml:space="preserve">.</w:t>
+      </w:r>
+    </w:p>
+    <w:p>
+      <w:pPr>
+        <w:pBdr>
+          <w:left w:val="single" w:color="0A6A4F" w:sz="12" w:space="10"/>
+        </w:pBdr>
+        <w:spacing w:after="100" w:line="288"/>
+        <w:ind w:left="431"/>
+      </w:pPr>
+      <w:r>
+        <w:rPr>
+          <w:color w:val="12191C"/>
+          <w:sz w:val="22"/>
+          <w:szCs w:val="22"/>
+        </w:rPr>
+        <w:t xml:space="preserve">“Then the three containers are built and health-checked over HTTP. All three pass.”</w:t>
+      </w:r>
+    </w:p>
+    <w:p>
+      <w:pPr>
+        <w:spacing w:after="100"/>
+      </w:pPr>
+      <w:r>
+        <w:rPr>
+          <w:b/>
+          <w:bCs/>
+          <w:color w:val="0A6A4F"/>
+          <w:sz w:val="18"/>
+          <w:szCs w:val="18"/>
+        </w:rPr>
+        <w:t xml:space="preserve">DO   </w:t>
+      </w:r>
+      <w:r>
+        <w:rPr>
+          <w:color w:val="12191C"/>
+          <w:sz w:val="21"/>
+          <w:szCs w:val="21"/>
+        </w:rPr>
+        <w:t xml:space="preserve">Scroll to </w:t>
+      </w:r>
+      <w:r>
+        <w:rPr>
+          <w:b/>
+          <w:bCs/>
+          <w:color w:val="12191C"/>
+          <w:sz w:val="21"/>
+          <w:szCs w:val="21"/>
+        </w:rPr>
+        <w:t xml:space="preserve">Artifacts</w:t>
+      </w:r>
+      <w:r>
+        <w:rPr>
+          <w:color w:val="12191C"/>
+          <w:sz w:val="21"/>
+          <w:szCs w:val="21"/>
+        </w:rPr>
+        <w:t xml:space="preserve">.</w:t>
+      </w:r>
+    </w:p>
+    <w:p>
+      <w:pPr>
+        <w:pBdr>
+          <w:left w:val="single" w:color="0A6A4F" w:sz="12" w:space="10"/>
+        </w:pBdr>
+        <w:spacing w:after="100" w:line="288"/>
+        <w:ind w:left="431"/>
+      </w:pPr>
+      <w:r>
+        <w:rPr>
+          <w:color w:val="12191C"/>
+          <w:sz w:val="22"/>
+          <w:szCs w:val="22"/>
+        </w:rPr>
+        <w:t xml:space="preserve">“And each run produces an evidence report, tied to the commit that triggered it, which we include in the technical report.”</w:t>
+      </w:r>
+    </w:p>
+    <w:p>
+      <w:pPr>
+        <w:pBdr>
+          <w:bottom w:val="single" w:color="D8DDDA" w:sz="6" w:space="1"/>
+        </w:pBdr>
+        <w:spacing w:after="160" w:before="160"/>
+      </w:pPr>
+    </w:p>
+    <w:p>
+      <w:pPr>
+        <w:spacing w:after="100" w:line="276"/>
+      </w:pPr>
+      <w:r>
+        <w:rPr>
+          <w:b/>
+          <w:bCs/>
+          <w:color w:val="12191C"/>
+          <w:sz w:val="21"/>
+          <w:szCs w:val="21"/>
+        </w:rPr>
+        <w:t xml:space="preserve">Preparation for both segments</w:t>
+      </w:r>
+    </w:p>
+    <w:p>
+      <w:pPr>
+        <w:spacing w:after="70"/>
+        <w:ind w:left="172"/>
+      </w:pPr>
+      <w:r>
+        <w:rPr>
+          <w:color w:val="6B7A75"/>
+          <w:sz w:val="21"/>
+          <w:szCs w:val="21"/>
+        </w:rPr>
+        <w:t xml:space="preserve">☐   </w:t>
+      </w:r>
+      <w:r>
+        <w:rPr>
+          <w:rFonts w:ascii="Consolas" w:cs="Consolas" w:eastAsia="Consolas" w:hAnsi="Consolas"/>
+          <w:color w:val="12191C"/>
+          <w:sz w:val="20"/>
+          <w:szCs w:val="20"/>
+        </w:rPr>
+        <w:t xml:space="preserve">docker compose build</w:t>
+      </w:r>
+      <w:r>
+        <w:rPr>
+          <w:color w:val="12191C"/>
+          <w:sz w:val="21"/>
+          <w:szCs w:val="21"/>
+        </w:rPr>
+        <w:t xml:space="preserve">  run beforehand, then </w:t>
+      </w:r>
+      <w:r>
+        <w:rPr>
+          <w:rFonts w:ascii="Consolas" w:cs="Consolas" w:eastAsia="Consolas" w:hAnsi="Consolas"/>
+          <w:color w:val="12191C"/>
+          <w:sz w:val="20"/>
+          <w:szCs w:val="20"/>
+        </w:rPr>
+        <w:t xml:space="preserve">docker compose down</w:t>
+      </w:r>
+    </w:p>
+    <w:p>
+      <w:pPr>
+        <w:spacing w:after="70"/>
+        <w:ind w:left="172"/>
+      </w:pPr>
+      <w:r>
+        <w:rPr>
+          <w:color w:val="6B7A75"/>
+          <w:sz w:val="21"/>
+          <w:szCs w:val="21"/>
+        </w:rPr>
+        <w:t xml:space="preserve">☐   </w:t>
+      </w:r>
+      <w:r>
+        <w:rPr>
+          <w:color w:val="12191C"/>
+          <w:sz w:val="21"/>
+          <w:szCs w:val="21"/>
+        </w:rPr>
+        <w:t xml:space="preserve">A green workflow run finished and open in a browser tab</w:t>
+      </w:r>
+    </w:p>
+    <w:p>
+      <w:pPr>
+        <w:spacing w:after="70"/>
+        <w:ind w:left="172"/>
+      </w:pPr>
+      <w:r>
+        <w:rPr>
+          <w:color w:val="6B7A75"/>
+          <w:sz w:val="21"/>
+          <w:szCs w:val="21"/>
+        </w:rPr>
+        <w:t xml:space="preserve">☐   </w:t>
+      </w:r>
+      <w:r>
+        <w:rPr>
+          <w:color w:val="12191C"/>
+          <w:sz w:val="21"/>
+          <w:szCs w:val="21"/>
+        </w:rPr>
+        <w:t xml:space="preserve">Editor font enlarged — YAML is unreadable at normal size on video</w:t>
+      </w:r>
+    </w:p>
+    <w:p>
+      <w:pPr>
+        <w:spacing w:after="70"/>
+        <w:ind w:left="172"/>
+      </w:pPr>
+      <w:r>
+        <w:rPr>
+          <w:color w:val="6B7A75"/>
+          <w:sz w:val="21"/>
+          <w:szCs w:val="21"/>
+        </w:rPr>
+        <w:t xml:space="preserve">☐   </w:t>
+      </w:r>
+      <w:r>
+        <w:rPr>
+          <w:color w:val="12191C"/>
+          <w:sz w:val="21"/>
+          <w:szCs w:val="21"/>
+        </w:rPr>
+        <w:t xml:space="preserve">If a run is red, fix it and re-run </w:t>
+      </w:r>
+      <w:r>
+        <w:rPr>
+          <w:b/>
+          <w:bCs/>
+          <w:color w:val="12191C"/>
+          <w:sz w:val="21"/>
+          <w:szCs w:val="21"/>
+        </w:rPr>
+        <w:t xml:space="preserve">before</w:t>
+      </w:r>
+      <w:r>
+        <w:rPr>
+          <w:color w:val="12191C"/>
+          <w:sz w:val="21"/>
+          <w:szCs w:val="21"/>
+        </w:rPr>
+        <w:t xml:space="preserve"> recording. Do not narrate a failure.</w:t>
       </w:r>
     </w:p>
     <w:p>

</xml_diff>